<commit_message>
Add verified buy links and correct BOM prices
LilyGO board, 230 V opto inputs and SMPS cost more than first estimated;
panel total and bid estimate updated. Report rebuilt as Rev C with a
buy-links section.

Co-Authored-By: Claude Opus 5.5 (1M context) <noreply@anthropic.com>
Claude-Session: https://claude.ai/code/session_011VMAWC9jRU9dk6uHbRoQCF
</commit_message>
<xml_diff>
--- a/docs/report/CMS-Project-Report.docx
+++ b/docs/report/CMS-Project-Report.docx
@@ -113,7 +113,7 @@
         <w:t xml:space="preserve"> </w:t>
       </w:r>
       <w:r>
-        <w:t xml:space="preserve">B</w:t>
+        <w:t xml:space="preserve">C</w:t>
       </w:r>
       <w:r>
         <w:t xml:space="preserve"> </w:t>
@@ -3087,7 +3087,7 @@
       </w:r>
     </w:p>
     <w:bookmarkEnd w:id="44"/>
-    <w:bookmarkStart w:id="47" w:name="parts-list-ek-panel-10-kw"/>
+    <w:bookmarkStart w:id="71" w:name="parts-list-ek-panel-10-kw"/>
     <w:p>
       <w:pPr>
         <w:pStyle w:val="Heading1"/>
@@ -3898,7 +3898,7 @@
               <w:jc w:val="left"/>
             </w:pPr>
             <w:r>
-              <w:t xml:space="preserve">LilyGO T-A7670E (ESP32 + A7670 LTE Cat-1) with antenna</w:t>
+              <w:t xml:space="preserve">LilyGO T-A7670E/G (ESP32 + A7670 LTE Cat-1) with antenna. Imported in bulk; ₹6,999 at Indian retail for one prototype</w:t>
             </w:r>
           </w:p>
         </w:tc>
@@ -3922,7 +3922,7 @@
               <w:jc w:val="right"/>
             </w:pPr>
             <w:r>
-              <w:t xml:space="preserve">2,300–2,800</w:t>
+              <w:t xml:space="preserve">3,500–4,500</w:t>
             </w:r>
           </w:p>
         </w:tc>
@@ -3960,7 +3960,7 @@
               <w:jc w:val="left"/>
             </w:pPr>
             <w:r>
-              <w:t xml:space="preserve">230 V AC → 5 V 3 A SMPS (replaces 12 V SMPS + buck)</w:t>
+              <w:t xml:space="preserve">230 V AC → 5 V 3 A SMPS, Mean Well RS-15-5 (replaces 12 V SMPS + buck)</w:t>
             </w:r>
           </w:p>
         </w:tc>
@@ -3984,7 +3984,7 @@
               <w:jc w:val="right"/>
             </w:pPr>
             <w:r>
-              <w:t xml:space="preserve">350–500</w:t>
+              <w:t xml:space="preserve">450–600</w:t>
             </w:r>
           </w:p>
         </w:tc>
@@ -4270,19 +4270,19 @@
               <w:jc w:val="left"/>
             </w:pPr>
             <w:r>
-              <w:t xml:space="preserve">230 V opto-isolated, 8 channel (6 outgoing MCBs + contactor aux + spare)</w:t>
-            </w:r>
-          </w:p>
-        </w:tc>
-        <w:tc>
-          <w:tcPr/>
-          <w:p>
-            <w:pPr>
-              <w:pStyle w:val="Compact"/>
-              <w:jc w:val="left"/>
-            </w:pPr>
-            <w:r>
-              <w:t xml:space="preserve">1</w:t>
+              <w:t xml:space="preserve">230 V opto-isolated, 1 channel each (6 outgoing MCBs + contactor aux). No 8-channel 230 V module is sold in India</w:t>
+            </w:r>
+          </w:p>
+        </w:tc>
+        <w:tc>
+          <w:tcPr/>
+          <w:p>
+            <w:pPr>
+              <w:pStyle w:val="Compact"/>
+              <w:jc w:val="left"/>
+            </w:pPr>
+            <w:r>
+              <w:t xml:space="preserve">7</w:t>
             </w:r>
           </w:p>
         </w:tc>
@@ -4294,7 +4294,7 @@
               <w:jc w:val="right"/>
             </w:pPr>
             <w:r>
-              <w:t xml:space="preserve">400–500</w:t>
+              <w:t xml:space="preserve">1,000–1,100</w:t>
             </w:r>
           </w:p>
         </w:tc>
@@ -4726,7 +4726,7 @@
                 <w:bCs/>
                 <w:b/>
               </w:rPr>
-              <w:t xml:space="preserve">≈ 25,500–32,500</w:t>
+              <w:t xml:space="preserve">≈ 27,500–35,000</w:t>
             </w:r>
           </w:p>
         </w:tc>
@@ -5219,8 +5219,1598 @@
       </w:tr>
     </w:tbl>
     <w:bookmarkEnd w:id="46"/>
-    <w:bookmarkEnd w:id="47"/>
-    <w:bookmarkStart w:id="51" w:name="working-logic"/>
+    <w:bookmarkStart w:id="70" w:name="kahan-se-khareedein-buy-links"/>
+    <w:p>
+      <w:pPr>
+        <w:pStyle w:val="Heading2"/>
+      </w:pPr>
+      <w:r>
+        <w:t xml:space="preserve">6.3 Kahan se khareedein (buy links)</w:t>
+      </w:r>
+    </w:p>
+    <w:p>
+      <w:pPr>
+        <w:pStyle w:val="FirstParagraph"/>
+      </w:pPr>
+      <w:r>
+        <w:t xml:space="preserve">Ye links 10 October 2026 ko check kiye, price us din page pe jo dikha wahi hai. Price aur stock badalte rehte hain. 160 panel ke liye brand distributor se bulk quote lo; shop ka rate sirf reference hai.</w:t>
+      </w:r>
+      <w:r>
+        <w:t xml:space="preserve"> </w:t>
+      </w:r>
+      <w:r>
+        <w:t xml:space="preserve">“</w:t>
+      </w:r>
+      <w:r>
+        <w:t xml:space="preserve">Search</w:t>
+      </w:r>
+      <w:r>
+        <w:t xml:space="preserve">”</w:t>
+      </w:r>
+      <w:r>
+        <w:t xml:space="preserve"> </w:t>
+      </w:r>
+      <w:r>
+        <w:t xml:space="preserve">wale links seller ki list kholte hain (generic item ya dealer quote wala item); IndiaMART aur Amazon.in ke search page automated check block karte hain, isliye wo khol ke check nahi ho paye.</w:t>
+      </w:r>
+    </w:p>
+    <w:tbl>
+      <w:tblPr>
+        <w:tblStyle w:val="Table"/>
+        <w:tblW w:type="pct" w:w="5000"/>
+        <w:tblLook w:firstRow="1" w:lastRow="0" w:firstColumn="0" w:lastColumn="0" w:noHBand="0" w:noVBand="0" w:val="0020"/>
+        <w:jc w:val="start"/>
+      </w:tblPr>
+      <w:tblGrid>
+        <w:gridCol w:w="1485"/>
+        <w:gridCol w:w="1485"/>
+        <w:gridCol w:w="1485"/>
+        <w:gridCol w:w="1980"/>
+        <w:gridCol w:w="1485"/>
+      </w:tblGrid>
+      <w:tr>
+        <w:trPr>
+          <w:tblHeader w:val="true"/>
+        </w:trPr>
+        <w:tc>
+          <w:tcPr/>
+          <w:p>
+            <w:pPr>
+              <w:pStyle w:val="Compact"/>
+              <w:jc w:val="left"/>
+            </w:pPr>
+            <w:r>
+              <w:t xml:space="preserve">#</w:t>
+            </w:r>
+          </w:p>
+        </w:tc>
+        <w:tc>
+          <w:tcPr/>
+          <w:p>
+            <w:pPr>
+              <w:pStyle w:val="Compact"/>
+              <w:jc w:val="left"/>
+            </w:pPr>
+            <w:r>
+              <w:t xml:space="preserve">Item</w:t>
+            </w:r>
+          </w:p>
+        </w:tc>
+        <w:tc>
+          <w:tcPr/>
+          <w:p>
+            <w:pPr>
+              <w:pStyle w:val="Compact"/>
+              <w:jc w:val="left"/>
+            </w:pPr>
+            <w:r>
+              <w:t xml:space="preserve">Link</w:t>
+            </w:r>
+          </w:p>
+        </w:tc>
+        <w:tc>
+          <w:tcPr/>
+          <w:p>
+            <w:pPr>
+              <w:pStyle w:val="Compact"/>
+              <w:jc w:val="right"/>
+            </w:pPr>
+            <w:r>
+              <w:t xml:space="preserve">Price seen ₹</w:t>
+            </w:r>
+          </w:p>
+        </w:tc>
+        <w:tc>
+          <w:tcPr/>
+          <w:p>
+            <w:pPr>
+              <w:pStyle w:val="Compact"/>
+              <w:jc w:val="left"/>
+            </w:pPr>
+            <w:r>
+              <w:t xml:space="preserve">Note</w:t>
+            </w:r>
+          </w:p>
+        </w:tc>
+      </w:tr>
+      <w:tr>
+        <w:tc>
+          <w:tcPr/>
+          <w:p>
+            <w:pPr>
+              <w:pStyle w:val="Compact"/>
+              <w:jc w:val="left"/>
+            </w:pPr>
+            <w:r>
+              <w:t xml:space="preserve">1</w:t>
+            </w:r>
+          </w:p>
+        </w:tc>
+        <w:tc>
+          <w:tcPr/>
+          <w:p>
+            <w:pPr>
+              <w:pStyle w:val="Compact"/>
+              <w:jc w:val="left"/>
+            </w:pPr>
+            <w:r>
+              <w:t xml:space="preserve">Panel enclosure, CRCA IP55</w:t>
+            </w:r>
+          </w:p>
+        </w:tc>
+        <w:tc>
+          <w:tcPr/>
+          <w:p>
+            <w:pPr>
+              <w:pStyle w:val="Compact"/>
+              <w:jc w:val="left"/>
+            </w:pPr>
+            <w:hyperlink r:id="rId47">
+              <w:r>
+                <w:rPr>
+                  <w:rStyle w:val="Hyperlink"/>
+                </w:rPr>
+                <w:t xml:space="preserve">IndiaMART search</w:t>
+              </w:r>
+            </w:hyperlink>
+          </w:p>
+        </w:tc>
+        <w:tc>
+          <w:tcPr/>
+          <w:p>
+            <w:pPr>
+              <w:pStyle w:val="Compact"/>
+              <w:jc w:val="right"/>
+            </w:pPr>
+            <w:r>
+              <w:t xml:space="preserve">quote</w:t>
+            </w:r>
+          </w:p>
+        </w:tc>
+        <w:tc>
+          <w:tcPr/>
+          <w:p>
+            <w:pPr>
+              <w:pStyle w:val="Compact"/>
+              <w:jc w:val="left"/>
+            </w:pPr>
+            <w:r>
+              <w:t xml:space="preserve">Search. A local fabricator is cheapest; give them the size and IP55 gasket spec.</w:t>
+            </w:r>
+          </w:p>
+        </w:tc>
+      </w:tr>
+      <w:tr>
+        <w:tc>
+          <w:tcPr/>
+          <w:p>
+            <w:pPr>
+              <w:pStyle w:val="Compact"/>
+              <w:jc w:val="left"/>
+            </w:pPr>
+            <w:r>
+              <w:t xml:space="preserve">2</w:t>
+            </w:r>
+          </w:p>
+        </w:tc>
+        <w:tc>
+          <w:tcPr/>
+          <w:p>
+            <w:pPr>
+              <w:pStyle w:val="Compact"/>
+              <w:jc w:val="left"/>
+            </w:pPr>
+            <w:r>
+              <w:t xml:space="preserve">Incomer 4P MCB 40 A C</w:t>
+            </w:r>
+          </w:p>
+        </w:tc>
+        <w:tc>
+          <w:tcPr/>
+          <w:p>
+            <w:pPr>
+              <w:pStyle w:val="Compact"/>
+              <w:jc w:val="left"/>
+            </w:pPr>
+            <w:hyperlink r:id="rId48">
+              <w:r>
+                <w:rPr>
+                  <w:rStyle w:val="Hyperlink"/>
+                </w:rPr>
+                <w:t xml:space="preserve">Havells DHMGCFPF040, L&amp;T SuFin</w:t>
+              </w:r>
+            </w:hyperlink>
+          </w:p>
+        </w:tc>
+        <w:tc>
+          <w:tcPr/>
+          <w:p>
+            <w:pPr>
+              <w:pStyle w:val="Compact"/>
+              <w:jc w:val="right"/>
+            </w:pPr>
+            <w:r>
+              <w:t xml:space="preserve">1,562</w:t>
+            </w:r>
+          </w:p>
+        </w:tc>
+        <w:tc>
+          <w:tcPr/>
+          <w:p>
+            <w:pPr>
+              <w:pStyle w:val="Compact"/>
+              <w:jc w:val="left"/>
+            </w:pPr>
+            <w:r>
+              <w:t xml:space="preserve">Product. Moglix also lists it at ₹1,581.</w:t>
+            </w:r>
+          </w:p>
+        </w:tc>
+      </w:tr>
+      <w:tr>
+        <w:tc>
+          <w:tcPr/>
+          <w:p>
+            <w:pPr>
+              <w:pStyle w:val="Compact"/>
+              <w:jc w:val="left"/>
+            </w:pPr>
+            <w:r>
+              <w:t xml:space="preserve">3</w:t>
+            </w:r>
+          </w:p>
+        </w:tc>
+        <w:tc>
+          <w:tcPr/>
+          <w:p>
+            <w:pPr>
+              <w:pStyle w:val="Compact"/>
+              <w:jc w:val="left"/>
+            </w:pPr>
+            <w:r>
+              <w:t xml:space="preserve">SPD Type 2, 4P</w:t>
+            </w:r>
+          </w:p>
+        </w:tc>
+        <w:tc>
+          <w:tcPr/>
+          <w:p>
+            <w:pPr>
+              <w:pStyle w:val="Compact"/>
+              <w:jc w:val="left"/>
+            </w:pPr>
+            <w:hyperlink r:id="rId49">
+              <w:r>
+                <w:rPr>
+                  <w:rStyle w:val="Hyperlink"/>
+                </w:rPr>
+                <w:t xml:space="preserve">IndiaMART SPD list</w:t>
+              </w:r>
+            </w:hyperlink>
+          </w:p>
+        </w:tc>
+        <w:tc>
+          <w:tcPr/>
+          <w:p>
+            <w:pPr>
+              <w:pStyle w:val="Compact"/>
+              <w:jc w:val="right"/>
+            </w:pPr>
+            <w:r>
+              <w:t xml:space="preserve">~1,050</w:t>
+            </w:r>
+          </w:p>
+        </w:tc>
+        <w:tc>
+          <w:tcPr/>
+          <w:p>
+            <w:pPr>
+              <w:pStyle w:val="Compact"/>
+              <w:jc w:val="left"/>
+            </w:pPr>
+            <w:r>
+              <w:t xml:space="preserve">Search. A Phoenix Type 2 4P 40 kA listing showed ₹1,050.</w:t>
+            </w:r>
+          </w:p>
+        </w:tc>
+      </w:tr>
+      <w:tr>
+        <w:tc>
+          <w:tcPr/>
+          <w:p>
+            <w:pPr>
+              <w:pStyle w:val="Compact"/>
+              <w:jc w:val="left"/>
+            </w:pPr>
+            <w:r>
+              <w:t xml:space="preserve">5</w:t>
+            </w:r>
+          </w:p>
+        </w:tc>
+        <w:tc>
+          <w:tcPr/>
+          <w:p>
+            <w:pPr>
+              <w:pStyle w:val="Compact"/>
+              <w:jc w:val="left"/>
+            </w:pPr>
+            <w:r>
+              <w:t xml:space="preserve">Energy meter Selec MFM383A-C</w:t>
+            </w:r>
+          </w:p>
+        </w:tc>
+        <w:tc>
+          <w:tcPr/>
+          <w:p>
+            <w:pPr>
+              <w:pStyle w:val="Compact"/>
+              <w:jc w:val="left"/>
+            </w:pPr>
+            <w:hyperlink r:id="rId50">
+              <w:r>
+                <w:rPr>
+                  <w:rStyle w:val="Hyperlink"/>
+                </w:rPr>
+                <w:t xml:space="preserve">Selec on IndiaMART</w:t>
+              </w:r>
+            </w:hyperlink>
+          </w:p>
+        </w:tc>
+        <w:tc>
+          <w:tcPr/>
+          <w:p>
+            <w:pPr>
+              <w:pStyle w:val="Compact"/>
+              <w:jc w:val="right"/>
+            </w:pPr>
+            <w:r>
+              <w:t xml:space="preserve">quote</w:t>
+            </w:r>
+          </w:p>
+        </w:tc>
+        <w:tc>
+          <w:tcPr/>
+          <w:p>
+            <w:pPr>
+              <w:pStyle w:val="Compact"/>
+              <w:jc w:val="left"/>
+            </w:pPr>
+            <w:r>
+              <w:t xml:space="preserve">Selec’s own store. Ask for the RS485 version (MFM383A-C-CE).</w:t>
+            </w:r>
+          </w:p>
+        </w:tc>
+      </w:tr>
+      <w:tr>
+        <w:tc>
+          <w:tcPr/>
+          <w:p>
+            <w:pPr>
+              <w:pStyle w:val="Compact"/>
+              <w:jc w:val="left"/>
+            </w:pPr>
+            <w:r>
+              <w:t xml:space="preserve">5</w:t>
+            </w:r>
+          </w:p>
+        </w:tc>
+        <w:tc>
+          <w:tcPr/>
+          <w:p>
+            <w:pPr>
+              <w:pStyle w:val="Compact"/>
+              <w:jc w:val="left"/>
+            </w:pPr>
+            <w:r>
+              <w:t xml:space="preserve">CTs 30/5 A or 50/5 A, ×3</w:t>
+            </w:r>
+          </w:p>
+        </w:tc>
+        <w:tc>
+          <w:tcPr/>
+          <w:p>
+            <w:pPr>
+              <w:pStyle w:val="Compact"/>
+              <w:jc w:val="left"/>
+            </w:pPr>
+            <w:hyperlink r:id="rId51">
+              <w:r>
+                <w:rPr>
+                  <w:rStyle w:val="Hyperlink"/>
+                </w:rPr>
+                <w:t xml:space="preserve">IndiaMART ring CT list</w:t>
+              </w:r>
+            </w:hyperlink>
+          </w:p>
+        </w:tc>
+        <w:tc>
+          <w:tcPr/>
+          <w:p>
+            <w:pPr>
+              <w:pStyle w:val="Compact"/>
+              <w:jc w:val="right"/>
+            </w:pPr>
+            <w:r>
+              <w:t xml:space="preserve">~550 each</w:t>
+            </w:r>
+          </w:p>
+        </w:tc>
+        <w:tc>
+          <w:tcPr/>
+          <w:p>
+            <w:pPr>
+              <w:pStyle w:val="Compact"/>
+              <w:jc w:val="left"/>
+            </w:pPr>
+            <w:r>
+              <w:t xml:space="preserve">Search. Class 1 accuracy is enough.</w:t>
+            </w:r>
+          </w:p>
+        </w:tc>
+      </w:tr>
+      <w:tr>
+        <w:tc>
+          <w:tcPr/>
+          <w:p>
+            <w:pPr>
+              <w:pStyle w:val="Compact"/>
+              <w:jc w:val="left"/>
+            </w:pPr>
+            <w:r>
+              <w:t xml:space="preserve">6</w:t>
+            </w:r>
+          </w:p>
+        </w:tc>
+        <w:tc>
+          <w:tcPr/>
+          <w:p>
+            <w:pPr>
+              <w:pStyle w:val="Compact"/>
+              <w:jc w:val="left"/>
+            </w:pPr>
+            <w:r>
+              <w:t xml:space="preserve">Contactor 4P 40 A AC-1, 230 V coil</w:t>
+            </w:r>
+          </w:p>
+        </w:tc>
+        <w:tc>
+          <w:tcPr/>
+          <w:p>
+            <w:pPr>
+              <w:pStyle w:val="Compact"/>
+              <w:jc w:val="left"/>
+            </w:pPr>
+            <w:hyperlink r:id="rId52">
+              <w:r>
+                <w:rPr>
+                  <w:rStyle w:val="Hyperlink"/>
+                </w:rPr>
+                <w:t xml:space="preserve">Contactors on L&amp;T SuFin</w:t>
+              </w:r>
+            </w:hyperlink>
+          </w:p>
+        </w:tc>
+        <w:tc>
+          <w:tcPr/>
+          <w:p>
+            <w:pPr>
+              <w:pStyle w:val="Compact"/>
+              <w:jc w:val="right"/>
+            </w:pPr>
+            <w:r>
+              <w:t xml:space="preserve">quote</w:t>
+            </w:r>
+          </w:p>
+        </w:tc>
+        <w:tc>
+          <w:tcPr/>
+          <w:p>
+            <w:pPr>
+              <w:pStyle w:val="Compact"/>
+              <w:jc w:val="left"/>
+            </w:pPr>
+            <w:r>
+              <w:t xml:space="preserve">Search. Ask for a 4-pole contactor rated 40 A AC-1 (for example Schneider LC1D25004M7 or Havells IHPHC series).</w:t>
+            </w:r>
+          </w:p>
+        </w:tc>
+      </w:tr>
+      <w:tr>
+        <w:tc>
+          <w:tcPr/>
+          <w:p>
+            <w:pPr>
+              <w:pStyle w:val="Compact"/>
+              <w:jc w:val="left"/>
+            </w:pPr>
+            <w:r>
+              <w:t xml:space="preserve">7</w:t>
+            </w:r>
+          </w:p>
+        </w:tc>
+        <w:tc>
+          <w:tcPr/>
+          <w:p>
+            <w:pPr>
+              <w:pStyle w:val="Compact"/>
+              <w:jc w:val="left"/>
+            </w:pPr>
+            <w:r>
+              <w:t xml:space="preserve">Outgoing MCB SP 16 A C, ×6</w:t>
+            </w:r>
+          </w:p>
+        </w:tc>
+        <w:tc>
+          <w:tcPr/>
+          <w:p>
+            <w:pPr>
+              <w:pStyle w:val="Compact"/>
+              <w:jc w:val="left"/>
+            </w:pPr>
+            <w:hyperlink r:id="rId53">
+              <w:r>
+                <w:rPr>
+                  <w:rStyle w:val="Hyperlink"/>
+                </w:rPr>
+                <w:t xml:space="preserve">Havells DHMGCSPF016, L&amp;T SuFin</w:t>
+              </w:r>
+            </w:hyperlink>
+          </w:p>
+        </w:tc>
+        <w:tc>
+          <w:tcPr/>
+          <w:p>
+            <w:pPr>
+              <w:pStyle w:val="Compact"/>
+              <w:jc w:val="right"/>
+            </w:pPr>
+            <w:r>
+              <w:t xml:space="preserve">152 each</w:t>
+            </w:r>
+          </w:p>
+        </w:tc>
+        <w:tc>
+          <w:tcPr/>
+          <w:p>
+            <w:pPr>
+              <w:pStyle w:val="Compact"/>
+              <w:jc w:val="left"/>
+            </w:pPr>
+            <w:r>
+              <w:t xml:space="preserve">Product.</w:t>
+            </w:r>
+          </w:p>
+        </w:tc>
+      </w:tr>
+      <w:tr>
+        <w:tc>
+          <w:tcPr/>
+          <w:p>
+            <w:pPr>
+              <w:pStyle w:val="Compact"/>
+              <w:jc w:val="left"/>
+            </w:pPr>
+            <w:r>
+              <w:t xml:space="preserve">7a</w:t>
+            </w:r>
+          </w:p>
+        </w:tc>
+        <w:tc>
+          <w:tcPr/>
+          <w:p>
+            <w:pPr>
+              <w:pStyle w:val="Compact"/>
+              <w:jc w:val="left"/>
+            </w:pPr>
+            <w:r>
+              <w:t xml:space="preserve">RCCB 4P 40 A 300 mA</w:t>
+            </w:r>
+          </w:p>
+        </w:tc>
+        <w:tc>
+          <w:tcPr/>
+          <w:p>
+            <w:pPr>
+              <w:pStyle w:val="Compact"/>
+              <w:jc w:val="left"/>
+            </w:pPr>
+            <w:hyperlink r:id="rId54">
+              <w:r>
+                <w:rPr>
+                  <w:rStyle w:val="Hyperlink"/>
+                </w:rPr>
+                <w:t xml:space="preserve">L&amp;T Exora BG404030, Moglix</w:t>
+              </w:r>
+            </w:hyperlink>
+          </w:p>
+        </w:tc>
+        <w:tc>
+          <w:tcPr/>
+          <w:p>
+            <w:pPr>
+              <w:pStyle w:val="Compact"/>
+              <w:jc w:val="right"/>
+            </w:pPr>
+            <w:r>
+              <w:t xml:space="preserve">2,888</w:t>
+            </w:r>
+          </w:p>
+        </w:tc>
+        <w:tc>
+          <w:tcPr/>
+          <w:p>
+            <w:pPr>
+              <w:pStyle w:val="Compact"/>
+              <w:jc w:val="left"/>
+            </w:pPr>
+            <w:r>
+              <w:t xml:space="preserve">Product,</w:t>
+            </w:r>
+            <w:r>
+              <w:t xml:space="preserve"> </w:t>
+            </w:r>
+            <w:r>
+              <w:t xml:space="preserve">“</w:t>
+            </w:r>
+            <w:r>
+              <w:t xml:space="preserve">available on request</w:t>
+            </w:r>
+            <w:r>
+              <w:t xml:space="preserve">”</w:t>
+            </w:r>
+            <w:r>
+              <w:t xml:space="preserve">. Also listed:</w:t>
+            </w:r>
+            <w:r>
+              <w:t xml:space="preserve"> </w:t>
+            </w:r>
+            <w:hyperlink r:id="rId55">
+              <w:r>
+                <w:rPr>
+                  <w:rStyle w:val="Hyperlink"/>
+                </w:rPr>
+                <w:t xml:space="preserve">Schneider Easy9 EZ9R65440</w:t>
+              </w:r>
+            </w:hyperlink>
+            <w:r>
+              <w:t xml:space="preserve"> </w:t>
+            </w:r>
+            <w:r>
+              <w:t xml:space="preserve">at ₹2,608 + GST, currently out of stock.</w:t>
+            </w:r>
+          </w:p>
+        </w:tc>
+      </w:tr>
+      <w:tr>
+        <w:tc>
+          <w:tcPr/>
+          <w:p>
+            <w:pPr>
+              <w:pStyle w:val="Compact"/>
+              <w:jc w:val="left"/>
+            </w:pPr>
+            <w:r>
+              <w:t xml:space="preserve">9</w:t>
+            </w:r>
+          </w:p>
+        </w:tc>
+        <w:tc>
+          <w:tcPr/>
+          <w:p>
+            <w:pPr>
+              <w:pStyle w:val="Compact"/>
+              <w:jc w:val="left"/>
+            </w:pPr>
+            <w:r>
+              <w:t xml:space="preserve">Selector switch 3-position, 22 mm</w:t>
+            </w:r>
+          </w:p>
+        </w:tc>
+        <w:tc>
+          <w:tcPr/>
+          <w:p>
+            <w:pPr>
+              <w:pStyle w:val="Compact"/>
+              <w:jc w:val="left"/>
+            </w:pPr>
+            <w:hyperlink r:id="rId56">
+              <w:r>
+                <w:rPr>
+                  <w:rStyle w:val="Hyperlink"/>
+                </w:rPr>
+                <w:t xml:space="preserve">IndiaMART selector list</w:t>
+              </w:r>
+            </w:hyperlink>
+          </w:p>
+        </w:tc>
+        <w:tc>
+          <w:tcPr/>
+          <w:p>
+            <w:pPr>
+              <w:pStyle w:val="Compact"/>
+              <w:jc w:val="right"/>
+            </w:pPr>
+            <w:r>
+              <w:t xml:space="preserve">~420</w:t>
+            </w:r>
+          </w:p>
+        </w:tc>
+        <w:tc>
+          <w:tcPr/>
+          <w:p>
+            <w:pPr>
+              <w:pStyle w:val="Compact"/>
+              <w:jc w:val="left"/>
+            </w:pPr>
+            <w:r>
+              <w:t xml:space="preserve">Search. Schneider XB5AK133B3N showed ₹422; a local make costs less.</w:t>
+            </w:r>
+          </w:p>
+        </w:tc>
+      </w:tr>
+      <w:tr>
+        <w:tc>
+          <w:tcPr/>
+          <w:p>
+            <w:pPr>
+              <w:pStyle w:val="Compact"/>
+              <w:jc w:val="left"/>
+            </w:pPr>
+            <w:r>
+              <w:t xml:space="preserve">10</w:t>
+            </w:r>
+          </w:p>
+        </w:tc>
+        <w:tc>
+          <w:tcPr/>
+          <w:p>
+            <w:pPr>
+              <w:pStyle w:val="Compact"/>
+              <w:jc w:val="left"/>
+            </w:pPr>
+            <w:r>
+              <w:t xml:space="preserve">Indicator lamps 22 mm LED, ×4</w:t>
+            </w:r>
+          </w:p>
+        </w:tc>
+        <w:tc>
+          <w:tcPr/>
+          <w:p>
+            <w:pPr>
+              <w:pStyle w:val="Compact"/>
+              <w:jc w:val="left"/>
+            </w:pPr>
+            <w:hyperlink r:id="rId57">
+              <w:r>
+                <w:rPr>
+                  <w:rStyle w:val="Hyperlink"/>
+                </w:rPr>
+                <w:t xml:space="preserve">IndiaMART search</w:t>
+              </w:r>
+            </w:hyperlink>
+          </w:p>
+        </w:tc>
+        <w:tc>
+          <w:tcPr/>
+          <w:p>
+            <w:pPr>
+              <w:pStyle w:val="Compact"/>
+              <w:jc w:val="right"/>
+            </w:pPr>
+            <w:r>
+              <w:t xml:space="preserve">quote</w:t>
+            </w:r>
+          </w:p>
+        </w:tc>
+        <w:tc>
+          <w:tcPr/>
+          <w:p>
+            <w:pPr>
+              <w:pStyle w:val="Compact"/>
+              <w:jc w:val="left"/>
+            </w:pPr>
+            <w:r>
+              <w:t xml:space="preserve">Search.</w:t>
+            </w:r>
+          </w:p>
+        </w:tc>
+      </w:tr>
+      <w:tr>
+        <w:tc>
+          <w:tcPr/>
+          <w:p>
+            <w:pPr>
+              <w:pStyle w:val="Compact"/>
+              <w:jc w:val="left"/>
+            </w:pPr>
+            <w:r>
+              <w:t xml:space="preserve">11</w:t>
+            </w:r>
+          </w:p>
+        </w:tc>
+        <w:tc>
+          <w:tcPr/>
+          <w:p>
+            <w:pPr>
+              <w:pStyle w:val="Compact"/>
+              <w:jc w:val="left"/>
+            </w:pPr>
+            <w:r>
+              <w:t xml:space="preserve">Controller LilyGO T-A7670</w:t>
+            </w:r>
+          </w:p>
+        </w:tc>
+        <w:tc>
+          <w:tcPr/>
+          <w:p>
+            <w:pPr>
+              <w:pStyle w:val="Compact"/>
+              <w:jc w:val="left"/>
+            </w:pPr>
+            <w:hyperlink r:id="rId58">
+              <w:r>
+                <w:rPr>
+                  <w:rStyle w:val="Hyperlink"/>
+                </w:rPr>
+                <w:t xml:space="preserve">LilyGO official</w:t>
+              </w:r>
+            </w:hyperlink>
+          </w:p>
+        </w:tc>
+        <w:tc>
+          <w:tcPr/>
+          <w:p>
+            <w:pPr>
+              <w:pStyle w:val="Compact"/>
+              <w:jc w:val="right"/>
+            </w:pPr>
+            <w:r>
+              <w:t xml:space="preserve">~2,750 + shipping and duty</w:t>
+            </w:r>
+          </w:p>
+        </w:tc>
+        <w:tc>
+          <w:tcPr/>
+          <w:p>
+            <w:pPr>
+              <w:pStyle w:val="Compact"/>
+              <w:jc w:val="left"/>
+            </w:pPr>
+            <w:r>
+              <w:t xml:space="preserve">Product, US$32.89. In India,</w:t>
+            </w:r>
+            <w:r>
+              <w:t xml:space="preserve"> </w:t>
+            </w:r>
+            <w:hyperlink r:id="rId59">
+              <w:r>
+                <w:rPr>
+                  <w:rStyle w:val="Hyperlink"/>
+                </w:rPr>
+                <w:t xml:space="preserve">Probots stocks the T-A7670G R2</w:t>
+              </w:r>
+            </w:hyperlink>
+            <w:r>
+              <w:t xml:space="preserve"> </w:t>
+            </w:r>
+            <w:r>
+              <w:t xml:space="preserve">at ₹6,999. Buy one from Probots for the prototype and import the 160 together. Check the LTE bands of the variant you pick (E or G) against your SIM operator.</w:t>
+            </w:r>
+          </w:p>
+        </w:tc>
+      </w:tr>
+      <w:tr>
+        <w:tc>
+          <w:tcPr/>
+          <w:p>
+            <w:pPr>
+              <w:pStyle w:val="Compact"/>
+              <w:jc w:val="left"/>
+            </w:pPr>
+            <w:r>
+              <w:t xml:space="preserve">12</w:t>
+            </w:r>
+          </w:p>
+        </w:tc>
+        <w:tc>
+          <w:tcPr/>
+          <w:p>
+            <w:pPr>
+              <w:pStyle w:val="Compact"/>
+              <w:jc w:val="left"/>
+            </w:pPr>
+            <w:r>
+              <w:t xml:space="preserve">SMPS 5 V 3 A, Mean Well RS-15-5</w:t>
+            </w:r>
+          </w:p>
+        </w:tc>
+        <w:tc>
+          <w:tcPr/>
+          <w:p>
+            <w:pPr>
+              <w:pStyle w:val="Compact"/>
+              <w:jc w:val="left"/>
+            </w:pPr>
+            <w:hyperlink r:id="rId60">
+              <w:r>
+                <w:rPr>
+                  <w:rStyle w:val="Hyperlink"/>
+                </w:rPr>
+                <w:t xml:space="preserve">Yash Controls on IndiaMART</w:t>
+              </w:r>
+            </w:hyperlink>
+          </w:p>
+        </w:tc>
+        <w:tc>
+          <w:tcPr/>
+          <w:p>
+            <w:pPr>
+              <w:pStyle w:val="Compact"/>
+              <w:jc w:val="right"/>
+            </w:pPr>
+            <w:r>
+              <w:t xml:space="preserve">585</w:t>
+            </w:r>
+          </w:p>
+        </w:tc>
+        <w:tc>
+          <w:tcPr/>
+          <w:p>
+            <w:pPr>
+              <w:pStyle w:val="Compact"/>
+              <w:jc w:val="left"/>
+            </w:pPr>
+            <w:r>
+              <w:t xml:space="preserve">Seller page that lists RS-15-5.</w:t>
+            </w:r>
+          </w:p>
+        </w:tc>
+      </w:tr>
+      <w:tr>
+        <w:tc>
+          <w:tcPr/>
+          <w:p>
+            <w:pPr>
+              <w:pStyle w:val="Compact"/>
+              <w:jc w:val="left"/>
+            </w:pPr>
+            <w:r>
+              <w:t xml:space="preserve">13</w:t>
+            </w:r>
+          </w:p>
+        </w:tc>
+        <w:tc>
+          <w:tcPr/>
+          <w:p>
+            <w:pPr>
+              <w:pStyle w:val="Compact"/>
+              <w:jc w:val="left"/>
+            </w:pPr>
+            <w:r>
+              <w:t xml:space="preserve">18650 Li-ion cell</w:t>
+            </w:r>
+          </w:p>
+        </w:tc>
+        <w:tc>
+          <w:tcPr/>
+          <w:p>
+            <w:pPr>
+              <w:pStyle w:val="Compact"/>
+              <w:jc w:val="left"/>
+            </w:pPr>
+            <w:hyperlink r:id="rId61">
+              <w:r>
+                <w:rPr>
+                  <w:rStyle w:val="Hyperlink"/>
+                </w:rPr>
+                <w:t xml:space="preserve">Amazon.in search</w:t>
+              </w:r>
+            </w:hyperlink>
+          </w:p>
+        </w:tc>
+        <w:tc>
+          <w:tcPr/>
+          <w:p>
+            <w:pPr>
+              <w:pStyle w:val="Compact"/>
+              <w:jc w:val="right"/>
+            </w:pPr>
+            <w:r>
+              <w:t xml:space="preserve">~200–250</w:t>
+            </w:r>
+          </w:p>
+        </w:tc>
+        <w:tc>
+          <w:tcPr/>
+          <w:p>
+            <w:pPr>
+              <w:pStyle w:val="Compact"/>
+              <w:jc w:val="left"/>
+            </w:pPr>
+            <w:r>
+              <w:t xml:space="preserve">Search. Buy a branded cell (Samsung, LG, Panasonic), not an unbranded one.</w:t>
+            </w:r>
+          </w:p>
+        </w:tc>
+      </w:tr>
+      <w:tr>
+        <w:tc>
+          <w:tcPr/>
+          <w:p>
+            <w:pPr>
+              <w:pStyle w:val="Compact"/>
+              <w:jc w:val="left"/>
+            </w:pPr>
+            <w:r>
+              <w:t xml:space="preserve">14</w:t>
+            </w:r>
+          </w:p>
+        </w:tc>
+        <w:tc>
+          <w:tcPr/>
+          <w:p>
+            <w:pPr>
+              <w:pStyle w:val="Compact"/>
+              <w:jc w:val="left"/>
+            </w:pPr>
+            <w:r>
+              <w:t xml:space="preserve">RTC DS3231</w:t>
+            </w:r>
+          </w:p>
+        </w:tc>
+        <w:tc>
+          <w:tcPr/>
+          <w:p>
+            <w:pPr>
+              <w:pStyle w:val="Compact"/>
+              <w:jc w:val="left"/>
+            </w:pPr>
+            <w:hyperlink r:id="rId62">
+              <w:r>
+                <w:rPr>
+                  <w:rStyle w:val="Hyperlink"/>
+                </w:rPr>
+                <w:t xml:space="preserve">Robu DS3231 via IndiaMART</w:t>
+              </w:r>
+            </w:hyperlink>
+          </w:p>
+        </w:tc>
+        <w:tc>
+          <w:tcPr/>
+          <w:p>
+            <w:pPr>
+              <w:pStyle w:val="Compact"/>
+              <w:jc w:val="right"/>
+            </w:pPr>
+            <w:r>
+              <w:t xml:space="preserve">350</w:t>
+            </w:r>
+          </w:p>
+        </w:tc>
+        <w:tc>
+          <w:tcPr/>
+          <w:p>
+            <w:pPr>
+              <w:pStyle w:val="Compact"/>
+              <w:jc w:val="left"/>
+            </w:pPr>
+            <w:r>
+              <w:t xml:space="preserve">Product. Robu’s own page did not open in the check.</w:t>
+            </w:r>
+          </w:p>
+        </w:tc>
+      </w:tr>
+      <w:tr>
+        <w:tc>
+          <w:tcPr/>
+          <w:p>
+            <w:pPr>
+              <w:pStyle w:val="Compact"/>
+              <w:jc w:val="left"/>
+            </w:pPr>
+            <w:r>
+              <w:t xml:space="preserve">15</w:t>
+            </w:r>
+          </w:p>
+        </w:tc>
+        <w:tc>
+          <w:tcPr/>
+          <w:p>
+            <w:pPr>
+              <w:pStyle w:val="Compact"/>
+              <w:jc w:val="left"/>
+            </w:pPr>
+            <w:r>
+              <w:t xml:space="preserve">TTL to RS485, auto direction</w:t>
+            </w:r>
+          </w:p>
+        </w:tc>
+        <w:tc>
+          <w:tcPr/>
+          <w:p>
+            <w:pPr>
+              <w:pStyle w:val="Compact"/>
+              <w:jc w:val="left"/>
+            </w:pPr>
+            <w:hyperlink r:id="rId63">
+              <w:r>
+                <w:rPr>
+                  <w:rStyle w:val="Hyperlink"/>
+                </w:rPr>
+                <w:t xml:space="preserve">Robu</w:t>
+              </w:r>
+            </w:hyperlink>
+          </w:p>
+        </w:tc>
+        <w:tc>
+          <w:tcPr/>
+          <w:p>
+            <w:pPr>
+              <w:pStyle w:val="Compact"/>
+              <w:jc w:val="right"/>
+            </w:pPr>
+            <w:r>
+              <w:t xml:space="preserve">99</w:t>
+            </w:r>
+          </w:p>
+        </w:tc>
+        <w:tc>
+          <w:tcPr/>
+          <w:p>
+            <w:pPr>
+              <w:pStyle w:val="Compact"/>
+              <w:jc w:val="left"/>
+            </w:pPr>
+            <w:r>
+              <w:t xml:space="preserve">Product.</w:t>
+            </w:r>
+          </w:p>
+        </w:tc>
+      </w:tr>
+      <w:tr>
+        <w:tc>
+          <w:tcPr/>
+          <w:p>
+            <w:pPr>
+              <w:pStyle w:val="Compact"/>
+              <w:jc w:val="left"/>
+            </w:pPr>
+            <w:r>
+              <w:t xml:space="preserve">16</w:t>
+            </w:r>
+          </w:p>
+        </w:tc>
+        <w:tc>
+          <w:tcPr/>
+          <w:p>
+            <w:pPr>
+              <w:pStyle w:val="Compact"/>
+              <w:jc w:val="left"/>
+            </w:pPr>
+            <w:r>
+              <w:t xml:space="preserve">Relay module 1-ch 5 V, opto</w:t>
+            </w:r>
+          </w:p>
+        </w:tc>
+        <w:tc>
+          <w:tcPr/>
+          <w:p>
+            <w:pPr>
+              <w:pStyle w:val="Compact"/>
+              <w:jc w:val="left"/>
+            </w:pPr>
+            <w:hyperlink r:id="rId64">
+              <w:r>
+                <w:rPr>
+                  <w:rStyle w:val="Hyperlink"/>
+                </w:rPr>
+                <w:t xml:space="preserve">Robu</w:t>
+              </w:r>
+            </w:hyperlink>
+          </w:p>
+        </w:tc>
+        <w:tc>
+          <w:tcPr/>
+          <w:p>
+            <w:pPr>
+              <w:pStyle w:val="Compact"/>
+              <w:jc w:val="right"/>
+            </w:pPr>
+            <w:r>
+              <w:t xml:space="preserve">69</w:t>
+            </w:r>
+          </w:p>
+        </w:tc>
+        <w:tc>
+          <w:tcPr/>
+          <w:p>
+            <w:pPr>
+              <w:pStyle w:val="Compact"/>
+              <w:jc w:val="left"/>
+            </w:pPr>
+            <w:r>
+              <w:t xml:space="preserve">Product.</w:t>
+            </w:r>
+          </w:p>
+        </w:tc>
+      </w:tr>
+      <w:tr>
+        <w:tc>
+          <w:tcPr/>
+          <w:p>
+            <w:pPr>
+              <w:pStyle w:val="Compact"/>
+              <w:jc w:val="left"/>
+            </w:pPr>
+            <w:r>
+              <w:t xml:space="preserve">17</w:t>
+            </w:r>
+          </w:p>
+        </w:tc>
+        <w:tc>
+          <w:tcPr/>
+          <w:p>
+            <w:pPr>
+              <w:pStyle w:val="Compact"/>
+              <w:jc w:val="left"/>
+            </w:pPr>
+            <w:r>
+              <w:t xml:space="preserve">230 V AC opto input, 1-ch, ×7</w:t>
+            </w:r>
+          </w:p>
+        </w:tc>
+        <w:tc>
+          <w:tcPr/>
+          <w:p>
+            <w:pPr>
+              <w:pStyle w:val="Compact"/>
+              <w:jc w:val="left"/>
+            </w:pPr>
+            <w:hyperlink r:id="rId65">
+              <w:r>
+                <w:rPr>
+                  <w:rStyle w:val="Hyperlink"/>
+                </w:rPr>
+                <w:t xml:space="preserve">Robu</w:t>
+              </w:r>
+            </w:hyperlink>
+          </w:p>
+        </w:tc>
+        <w:tc>
+          <w:tcPr/>
+          <w:p>
+            <w:pPr>
+              <w:pStyle w:val="Compact"/>
+              <w:jc w:val="right"/>
+            </w:pPr>
+            <w:r>
+              <w:t xml:space="preserve">150 each</w:t>
+            </w:r>
+          </w:p>
+        </w:tc>
+        <w:tc>
+          <w:tcPr/>
+          <w:p>
+            <w:pPr>
+              <w:pStyle w:val="Compact"/>
+              <w:jc w:val="left"/>
+            </w:pPr>
+            <w:r>
+              <w:t xml:space="preserve">Product. No 8-channel 230 V module was found in India, so use 7 single-channel modules (6 MCBs + contactor aux).</w:t>
+            </w:r>
+          </w:p>
+        </w:tc>
+      </w:tr>
+      <w:tr>
+        <w:tc>
+          <w:tcPr/>
+          <w:p>
+            <w:pPr>
+              <w:pStyle w:val="Compact"/>
+              <w:jc w:val="left"/>
+            </w:pPr>
+            <w:r>
+              <w:t xml:space="preserve">17a</w:t>
+            </w:r>
+          </w:p>
+        </w:tc>
+        <w:tc>
+          <w:tcPr/>
+          <w:p>
+            <w:pPr>
+              <w:pStyle w:val="Compact"/>
+              <w:jc w:val="left"/>
+            </w:pPr>
+            <w:r>
+              <w:t xml:space="preserve">PCF8574 I/O expander</w:t>
+            </w:r>
+          </w:p>
+        </w:tc>
+        <w:tc>
+          <w:tcPr/>
+          <w:p>
+            <w:pPr>
+              <w:pStyle w:val="Compact"/>
+              <w:jc w:val="left"/>
+            </w:pPr>
+            <w:hyperlink r:id="rId66">
+              <w:r>
+                <w:rPr>
+                  <w:rStyle w:val="Hyperlink"/>
+                </w:rPr>
+                <w:t xml:space="preserve">Robu</w:t>
+              </w:r>
+            </w:hyperlink>
+          </w:p>
+        </w:tc>
+        <w:tc>
+          <w:tcPr/>
+          <w:p>
+            <w:pPr>
+              <w:pStyle w:val="Compact"/>
+              <w:jc w:val="right"/>
+            </w:pPr>
+            <w:r>
+              <w:t xml:space="preserve">79</w:t>
+            </w:r>
+          </w:p>
+        </w:tc>
+        <w:tc>
+          <w:tcPr/>
+          <w:p>
+            <w:pPr>
+              <w:pStyle w:val="Compact"/>
+              <w:jc w:val="left"/>
+            </w:pPr>
+            <w:r>
+              <w:t xml:space="preserve">Product.</w:t>
+            </w:r>
+          </w:p>
+        </w:tc>
+      </w:tr>
+      <w:tr>
+        <w:tc>
+          <w:tcPr/>
+          <w:p>
+            <w:pPr>
+              <w:pStyle w:val="Compact"/>
+              <w:jc w:val="left"/>
+            </w:pPr>
+            <w:r>
+              <w:t xml:space="preserve">18</w:t>
+            </w:r>
+          </w:p>
+        </w:tc>
+        <w:tc>
+          <w:tcPr/>
+          <w:p>
+            <w:pPr>
+              <w:pStyle w:val="Compact"/>
+              <w:jc w:val="left"/>
+            </w:pPr>
+            <w:r>
+              <w:t xml:space="preserve">Door limit switch</w:t>
+            </w:r>
+          </w:p>
+        </w:tc>
+        <w:tc>
+          <w:tcPr/>
+          <w:p>
+            <w:pPr>
+              <w:pStyle w:val="Compact"/>
+              <w:jc w:val="left"/>
+            </w:pPr>
+            <w:hyperlink r:id="rId67">
+              <w:r>
+                <w:rPr>
+                  <w:rStyle w:val="Hyperlink"/>
+                </w:rPr>
+                <w:t xml:space="preserve">IndiaMART search</w:t>
+              </w:r>
+            </w:hyperlink>
+          </w:p>
+        </w:tc>
+        <w:tc>
+          <w:tcPr/>
+          <w:p>
+            <w:pPr>
+              <w:pStyle w:val="Compact"/>
+              <w:jc w:val="right"/>
+            </w:pPr>
+            <w:r>
+              <w:t xml:space="preserve">~100–150</w:t>
+            </w:r>
+          </w:p>
+        </w:tc>
+        <w:tc>
+          <w:tcPr/>
+          <w:p>
+            <w:pPr>
+              <w:pStyle w:val="Compact"/>
+              <w:jc w:val="left"/>
+            </w:pPr>
+            <w:r>
+              <w:t xml:space="preserve">Search.</w:t>
+            </w:r>
+          </w:p>
+        </w:tc>
+      </w:tr>
+      <w:tr>
+        <w:tc>
+          <w:tcPr/>
+          <w:p>
+            <w:pPr>
+              <w:pStyle w:val="Compact"/>
+              <w:jc w:val="left"/>
+            </w:pPr>
+            <w:r>
+              <w:t xml:space="preserve">19</w:t>
+            </w:r>
+          </w:p>
+        </w:tc>
+        <w:tc>
+          <w:tcPr/>
+          <w:p>
+            <w:pPr>
+              <w:pStyle w:val="Compact"/>
+              <w:jc w:val="left"/>
+            </w:pPr>
+            <w:r>
+              <w:t xml:space="preserve">4G antenna, SMA panel mount</w:t>
+            </w:r>
+          </w:p>
+        </w:tc>
+        <w:tc>
+          <w:tcPr/>
+          <w:p>
+            <w:pPr>
+              <w:pStyle w:val="Compact"/>
+              <w:jc w:val="left"/>
+            </w:pPr>
+            <w:hyperlink r:id="rId68">
+              <w:r>
+                <w:rPr>
+                  <w:rStyle w:val="Hyperlink"/>
+                </w:rPr>
+                <w:t xml:space="preserve">Amazon.in search</w:t>
+              </w:r>
+            </w:hyperlink>
+          </w:p>
+        </w:tc>
+        <w:tc>
+          <w:tcPr/>
+          <w:p>
+            <w:pPr>
+              <w:pStyle w:val="Compact"/>
+              <w:jc w:val="right"/>
+            </w:pPr>
+            <w:r>
+              <w:t xml:space="preserve">~250–300</w:t>
+            </w:r>
+          </w:p>
+        </w:tc>
+        <w:tc>
+          <w:tcPr/>
+          <w:p>
+            <w:pPr>
+              <w:pStyle w:val="Compact"/>
+              <w:jc w:val="left"/>
+            </w:pPr>
+            <w:r>
+              <w:t xml:space="preserve">Search.</w:t>
+            </w:r>
+          </w:p>
+        </w:tc>
+      </w:tr>
+      <w:tr>
+        <w:tc>
+          <w:tcPr/>
+          <w:p>
+            <w:pPr>
+              <w:pStyle w:val="Compact"/>
+              <w:jc w:val="left"/>
+            </w:pPr>
+            <w:r>
+              <w:t xml:space="preserve">20</w:t>
+            </w:r>
+          </w:p>
+        </w:tc>
+        <w:tc>
+          <w:tcPr/>
+          <w:p>
+            <w:pPr>
+              <w:pStyle w:val="Compact"/>
+              <w:jc w:val="left"/>
+            </w:pPr>
+            <w:r>
+              <w:t xml:space="preserve">Terminal blocks 63 A (16/25 sq mm), ×4</w:t>
+            </w:r>
+          </w:p>
+        </w:tc>
+        <w:tc>
+          <w:tcPr/>
+          <w:p>
+            <w:pPr>
+              <w:pStyle w:val="Compact"/>
+              <w:jc w:val="left"/>
+            </w:pPr>
+            <w:hyperlink r:id="rId69">
+              <w:r>
+                <w:rPr>
+                  <w:rStyle w:val="Hyperlink"/>
+                </w:rPr>
+                <w:t xml:space="preserve">IndiaMART search</w:t>
+              </w:r>
+            </w:hyperlink>
+          </w:p>
+        </w:tc>
+        <w:tc>
+          <w:tcPr/>
+          <w:p>
+            <w:pPr>
+              <w:pStyle w:val="Compact"/>
+              <w:jc w:val="right"/>
+            </w:pPr>
+            <w:r>
+              <w:t xml:space="preserve">quote</w:t>
+            </w:r>
+          </w:p>
+        </w:tc>
+        <w:tc>
+          <w:tcPr/>
+          <w:p>
+            <w:pPr>
+              <w:pStyle w:val="Compact"/>
+              <w:jc w:val="left"/>
+            </w:pPr>
+            <w:r>
+              <w:t xml:space="preserve">Search. Connectwell and Elmex are common Indian makes.</w:t>
+            </w:r>
+          </w:p>
+        </w:tc>
+      </w:tr>
+    </w:tbl>
+    <w:p>
+      <w:pPr>
+        <w:pStyle w:val="BodyText"/>
+      </w:pPr>
+      <w:r>
+        <w:rPr>
+          <w:bCs/>
+          <w:b/>
+        </w:rPr>
+        <w:t xml:space="preserve">Teen badlaav (BOM me theek kar diye):</w:t>
+      </w:r>
+      <w:r>
+        <w:t xml:space="preserve"> </w:t>
+      </w:r>
+      <w:r>
+        <w:t xml:space="preserve">LilyGO board pehle ke andaaze se mehnga hai (India me ₹6,999, import pe ~₹3,500–4,500), 8-channel 230 V opto module India me nahi mila isliye 7 single-channel module, aur SMPS thoda mehnga. Panel total ab ≈ ₹27,500–35,000.</w:t>
+      </w:r>
+    </w:p>
+    <w:bookmarkEnd w:id="70"/>
+    <w:bookmarkEnd w:id="71"/>
+    <w:bookmarkStart w:id="75" w:name="working-logic"/>
     <w:p>
       <w:pPr>
         <w:pStyle w:val="Heading1"/>
@@ -5229,7 +6819,7 @@
         <w:t xml:space="preserve">7. Working logic</w:t>
       </w:r>
     </w:p>
-    <w:bookmarkStart w:id="48" w:name="modes"/>
+    <w:bookmarkStart w:id="72" w:name="modes"/>
     <w:p>
       <w:pPr>
         <w:pStyle w:val="Heading2"/>
@@ -5413,8 +7003,8 @@
         <w:t xml:space="preserve">Selector switch AUTO pe na ho to controller sirf monitor aur report karta hai. Network chala jaye tab bhi lights panel ke andar ke timer se chalti rehti hain.</w:t>
       </w:r>
     </w:p>
-    <w:bookmarkEnd w:id="48"/>
-    <w:bookmarkStart w:id="49" w:name="har-cycle-me-kya-hota-hai"/>
+    <w:bookmarkEnd w:id="72"/>
+    <w:bookmarkStart w:id="73" w:name="har-cycle-me-kya-hota-hai"/>
     <w:p>
       <w:pPr>
         <w:pStyle w:val="Heading2"/>
@@ -5698,8 +7288,8 @@
         </w:tc>
       </w:tr>
     </w:tbl>
-    <w:bookmarkEnd w:id="49"/>
-    <w:bookmarkStart w:id="50" w:name="fault-detection"/>
+    <w:bookmarkEnd w:id="73"/>
+    <w:bookmarkStart w:id="74" w:name="fault-detection"/>
     <w:p>
       <w:pPr>
         <w:pStyle w:val="Heading2"/>
@@ -6443,9 +8033,9 @@
         <w:t xml:space="preserve">panel se ek-ek lamp ki kharabi nahi pakdi ja sakti. 83 lamp per phase pe ek phase me 4 ya zyada lamp band hon tabhi pata chalega. Kaun sa pole kharab hai, ye jaanne ke liye har lamp pe controller lagega, jo spec me nahi hai.</w:t>
       </w:r>
     </w:p>
-    <w:bookmarkEnd w:id="50"/>
-    <w:bookmarkEnd w:id="51"/>
-    <w:bookmarkStart w:id="55" w:name="firmware-aur-cms"/>
+    <w:bookmarkEnd w:id="74"/>
+    <w:bookmarkEnd w:id="75"/>
+    <w:bookmarkStart w:id="79" w:name="firmware-aur-cms"/>
     <w:p>
       <w:pPr>
         <w:pStyle w:val="Heading1"/>
@@ -6454,7 +8044,7 @@
         <w:t xml:space="preserve">8. Firmware aur CMS</w:t>
       </w:r>
     </w:p>
-    <w:bookmarkStart w:id="52" w:name="firmware"/>
+    <w:bookmarkStart w:id="76" w:name="firmware"/>
     <w:p>
       <w:pPr>
         <w:pStyle w:val="Heading2"/>
@@ -6846,8 +8436,8 @@
         </w:tc>
       </w:tr>
     </w:tbl>
-    <w:bookmarkEnd w:id="52"/>
-    <w:bookmarkStart w:id="53" w:name="cms-se-commands"/>
+    <w:bookmarkEnd w:id="76"/>
+    <w:bookmarkStart w:id="77" w:name="cms-se-commands"/>
     <w:p>
       <w:pPr>
         <w:pStyle w:val="Heading2"/>
@@ -7388,8 +8978,8 @@
         </w:tc>
       </w:tr>
     </w:tbl>
-    <w:bookmarkEnd w:id="53"/>
-    <w:bookmarkStart w:id="54" w:name="cms-software-thingsboard-ya-apna"/>
+    <w:bookmarkEnd w:id="77"/>
+    <w:bookmarkStart w:id="78" w:name="cms-software-thingsboard-ya-apna"/>
     <w:p>
       <w:pPr>
         <w:pStyle w:val="Heading2"/>
@@ -7764,9 +9354,9 @@
         <w:t xml:space="preserve">tender demo ke liye jo jaldi chal jaaye (dono ready hain), aur lambe samay ke liye apna software, kyunki license zero hai aur product aapka banta hai.</w:t>
       </w:r>
     </w:p>
-    <w:bookmarkEnd w:id="54"/>
-    <w:bookmarkEnd w:id="55"/>
-    <w:bookmarkStart w:id="56" w:name="panel-banane-ka-tareeka-assembly"/>
+    <w:bookmarkEnd w:id="78"/>
+    <w:bookmarkEnd w:id="79"/>
+    <w:bookmarkStart w:id="80" w:name="panel-banane-ka-tareeka-assembly"/>
     <w:p>
       <w:pPr>
         <w:pStyle w:val="Heading1"/>
@@ -7995,8 +9585,8 @@
         <w:t xml:space="preserve">neeche se glands ke through, IP55 bana rahe.</w:t>
       </w:r>
     </w:p>
-    <w:bookmarkEnd w:id="56"/>
-    <w:bookmarkStart w:id="61" w:name="testing-procedure"/>
+    <w:bookmarkEnd w:id="80"/>
+    <w:bookmarkStart w:id="85" w:name="testing-procedure"/>
     <w:p>
       <w:pPr>
         <w:pStyle w:val="Heading1"/>
@@ -8013,7 +9603,7 @@
         <w:t xml:space="preserve">Har test ke saamne result likho aur ✓ lagao. Har panel ki ek test sheet file karo (warranty ke liye kaam aayegi).</w:t>
       </w:r>
     </w:p>
-    <w:bookmarkStart w:id="57" w:name="bench-test-pehla-prototype-table-pe"/>
+    <w:bookmarkStart w:id="81" w:name="bench-test-pehla-prototype-table-pe"/>
     <w:p>
       <w:pPr>
         <w:pStyle w:val="Heading2"/>
@@ -8755,8 +10345,8 @@
         </w:tc>
       </w:tr>
     </w:tbl>
-    <w:bookmarkEnd w:id="57"/>
-    <w:bookmarkStart w:id="58" w:name="Xfb3cb3b8b0a59f0cd47c12317ee8334c349c08e"/>
+    <w:bookmarkEnd w:id="81"/>
+    <w:bookmarkStart w:id="82" w:name="Xfb3cb3b8b0a59f0cd47c12317ee8334c349c08e"/>
     <w:p>
       <w:pPr>
         <w:pStyle w:val="Heading2"/>
@@ -9527,8 +11117,8 @@
         </w:tc>
       </w:tr>
     </w:tbl>
-    <w:bookmarkEnd w:id="58"/>
-    <w:bookmarkStart w:id="59" w:name="load-test-prototype-ya-sample-panel"/>
+    <w:bookmarkEnd w:id="82"/>
+    <w:bookmarkStart w:id="83" w:name="load-test-prototype-ya-sample-panel"/>
     <w:p>
       <w:pPr>
         <w:pStyle w:val="Heading2"/>
@@ -10072,8 +11662,8 @@
         </w:tc>
       </w:tr>
     </w:tbl>
-    <w:bookmarkEnd w:id="59"/>
-    <w:bookmarkStart w:id="60" w:name="site-commissioning-har-panel"/>
+    <w:bookmarkEnd w:id="83"/>
+    <w:bookmarkStart w:id="84" w:name="site-commissioning-har-panel"/>
     <w:p>
       <w:pPr>
         <w:pStyle w:val="Heading2"/>
@@ -10658,9 +12248,9 @@
         </w:tc>
       </w:tr>
     </w:tbl>
-    <w:bookmarkEnd w:id="60"/>
-    <w:bookmarkEnd w:id="61"/>
-    <w:bookmarkStart w:id="62" w:name="bid-estimate-160-panels-cms-5-saal"/>
+    <w:bookmarkEnd w:id="84"/>
+    <w:bookmarkEnd w:id="85"/>
+    <w:bookmarkStart w:id="86" w:name="bid-estimate-160-panels-cms-5-saal"/>
     <w:p>
       <w:pPr>
         <w:pStyle w:val="Heading1"/>
@@ -10743,7 +12333,7 @@
               <w:jc w:val="right"/>
             </w:pPr>
             <w:r>
-              <w:t xml:space="preserve">23,000–29,500</w:t>
+              <w:t xml:space="preserve">24,700–31,500</w:t>
             </w:r>
           </w:p>
         </w:tc>
@@ -10755,7 +12345,7 @@
               <w:jc w:val="right"/>
             </w:pPr>
             <w:r>
-              <w:t xml:space="preserve">36.8–47.2 lakh</w:t>
+              <w:t xml:space="preserve">39.5–50.4 lakh</w:t>
             </w:r>
           </w:p>
         </w:tc>
@@ -10971,7 +12561,7 @@
               <w:jc w:val="right"/>
             </w:pPr>
             <w:r>
-              <w:t xml:space="preserve">2,300–2,950</w:t>
+              <w:t xml:space="preserve">2,500–3,150</w:t>
             </w:r>
           </w:p>
         </w:tc>
@@ -10983,7 +12573,7 @@
               <w:jc w:val="right"/>
             </w:pPr>
             <w:r>
-              <w:t xml:space="preserve">3.7–4.7 lakh</w:t>
+              <w:t xml:space="preserve">4.0–5.0 lakh</w:t>
             </w:r>
           </w:p>
         </w:tc>
@@ -11063,7 +12653,7 @@
                 <w:bCs/>
                 <w:b/>
               </w:rPr>
-              <w:t xml:space="preserve">≈ ₹65–94 lakh</w:t>
+              <w:t xml:space="preserve">≈ ₹68–97 lakh</w:t>
             </w:r>
           </w:p>
         </w:tc>
@@ -11077,8 +12667,8 @@
         <w:t xml:space="preserve">Iske upar apna margin aur 18% GST. 60 W ya 90 W lamp ho to rating table ka extra cost jodo (160 panel pe ₹4.8–9.6 lakh). Feeder cable aur poles isme nahi hain. Spec ka per-pole saamaan agar sab 40,000 pole pe lagna hai to ≈ ₹4.2–6.6 crore alag.</w:t>
       </w:r>
     </w:p>
-    <w:bookmarkEnd w:id="62"/>
-    <w:bookmarkStart w:id="63" w:name="safety"/>
+    <w:bookmarkEnd w:id="86"/>
+    <w:bookmarkStart w:id="87" w:name="safety"/>
     <w:p>
       <w:pPr>
         <w:pStyle w:val="Heading1"/>
@@ -11095,8 +12685,8 @@
         <w:t xml:space="preserve">415 V jaan le sakta hai. Power wiring aur testing licensed electrician se karwao. Panel body aur door earth karo. Panel ke andar kaam se pehle incomer OFF karke lock karo (lock-out). Megger test se pehle controller, SMPS aur opto module ke wire hata do.</w:t>
       </w:r>
     </w:p>
-    <w:bookmarkEnd w:id="63"/>
-    <w:bookmarkStart w:id="64" w:name="abhi-kya-tay-karna-baaki-hai"/>
+    <w:bookmarkEnd w:id="87"/>
+    <w:bookmarkStart w:id="88" w:name="abhi-kya-tay-karna-baaki-hai"/>
     <w:p>
       <w:pPr>
         <w:pStyle w:val="Heading1"/>
@@ -11153,8 +12743,8 @@
         <w:t xml:space="preserve">Firmware ka pehla compile aur bench test (Section 10.1); Selec meter ka word order confirm.</w:t>
       </w:r>
     </w:p>
-    <w:bookmarkEnd w:id="64"/>
-    <w:bookmarkStart w:id="65" w:name="appendix-a.-firmware-code"/>
+    <w:bookmarkEnd w:id="88"/>
+    <w:bookmarkStart w:id="89" w:name="appendix-a.-firmware-code"/>
     <w:p>
       <w:pPr>
         <w:pStyle w:val="Heading1"/>
@@ -44135,7 +45725,7 @@
         <w:t xml:space="preserve">}</w:t>
       </w:r>
     </w:p>
-    <w:bookmarkEnd w:id="65"/>
+    <w:bookmarkEnd w:id="89"/>
     <w:sectPr/>
   </w:body>
 </w:document>

</xml_diff>